<commit_message>
Add section divider lines to Word export
</commit_message>
<xml_diff>
--- a/cv-harvard.docx
+++ b/cv-harvard.docx
@@ -36,6 +36,9 @@
       <w:pPr>
         <w:spacing w:after="120"/>
         <w:jc w:val="center"/>
+        <w:pBdr>
+          <w:bottom w:val="single" w:sz="12" w:space="1" w:color="1A1A1A"/>
+        </w:pBdr>
       </w:pPr>
       <w:r>
         <w:rPr>
@@ -51,6 +54,9 @@
     <w:p>
       <w:pPr>
         <w:spacing w:before="200" w:after="60"/>
+        <w:pBdr>
+          <w:bottom w:val="single" w:sz="12" w:space="1" w:color="1A1A1A"/>
+        </w:pBdr>
       </w:pPr>
       <w:r>
         <w:rPr>
@@ -138,6 +144,9 @@
     <w:p>
       <w:pPr>
         <w:spacing w:before="200" w:after="60"/>
+        <w:pBdr>
+          <w:bottom w:val="single" w:sz="12" w:space="1" w:color="1A1A1A"/>
+        </w:pBdr>
       </w:pPr>
       <w:r>
         <w:rPr>
@@ -438,6 +447,9 @@
     <w:p>
       <w:pPr>
         <w:spacing w:before="200" w:after="60"/>
+        <w:pBdr>
+          <w:bottom w:val="single" w:sz="12" w:space="1" w:color="1A1A1A"/>
+        </w:pBdr>
       </w:pPr>
       <w:r>
         <w:rPr>
@@ -781,6 +793,9 @@
     <w:p>
       <w:pPr>
         <w:spacing w:before="200" w:after="60"/>
+        <w:pBdr>
+          <w:bottom w:val="single" w:sz="12" w:space="1" w:color="1A1A1A"/>
+        </w:pBdr>
       </w:pPr>
       <w:r>
         <w:rPr>
@@ -939,6 +954,9 @@
     <w:p>
       <w:pPr>
         <w:spacing w:before="200" w:after="60"/>
+        <w:pBdr>
+          <w:bottom w:val="single" w:sz="12" w:space="1" w:color="1A1A1A"/>
+        </w:pBdr>
       </w:pPr>
       <w:r>
         <w:rPr>

</xml_diff>

<commit_message>
Add Spanish Word export (cv-harvard-es.docx) + separate EN/ES download buttons
</commit_message>
<xml_diff>
--- a/cv-harvard.docx
+++ b/cv-harvard.docx
@@ -29,7 +29,7 @@
           <w:color w:val="333333"/>
           <w:sz w:val="19"/>
         </w:rPr>
-        <w:t>Cancún, México  |  81 3511 2848  |  Antony_cj12@outlook.com</w:t>
+        <w:t>Cancún, Mexico  |  81 3511 2848  |  Antony_cj12@outlook.com</w:t>
       </w:r>
     </w:p>
     <w:p>
@@ -89,7 +89,7 @@
           <w:color w:val="555555"/>
           <w:sz w:val="19"/>
         </w:rPr>
-        <w:t xml:space="preserve"> — Cancún, México</w:t>
+        <w:t xml:space="preserve"> — Cancún, Mexico</w:t>
       </w:r>
       <w:r>
         <w:rPr>
@@ -114,7 +114,7 @@
           <w:i/>
           <w:sz w:val="20"/>
         </w:rPr>
-        <w:t>Ingeniería en Desarrollo de Software (B.S. in Software Development Engineering)</w:t>
+        <w:t>B.S. in Software Development Engineering</w:t>
       </w:r>
     </w:p>
     <w:p>

</xml_diff>